<commit_message>
add: evidencias semana 5
</commit_message>
<xml_diff>
--- a/Evidencias Semana 5.docx
+++ b/Evidencias Semana 5.docx
@@ -92,11 +92,6 @@
       </w:r>
     </w:p>
     <w:p>
-      <w:r>
-        <w:t>Las siguientes evidencias integran las pruebas realizadas durante la actividad anterior y las nuevas pruebas correspondientes a la implementación del patrón BFF.</w:t>
-      </w:r>
-    </w:p>
-    <w:p>
       <w:pPr>
         <w:rPr>
           <w:b/>
@@ -173,12 +168,13 @@
       </w:pPr>
       <w:r>
         <w:rPr>
-          <w:noProof/>
+          <w:b/>
+          <w:bCs/>
         </w:rPr>
         <w:drawing>
-          <wp:inline distT="0" distB="0" distL="0" distR="0" wp14:anchorId="6F47DFB6" wp14:editId="5CB87BCE">
-            <wp:extent cx="5612130" cy="912495"/>
-            <wp:effectExtent l="0" t="0" r="7620" b="1905"/>
+          <wp:inline distT="0" distB="0" distL="0" distR="0" wp14:anchorId="3793B82E" wp14:editId="25228349">
+            <wp:extent cx="5612130" cy="471805"/>
+            <wp:effectExtent l="0" t="0" r="7620" b="4445"/>
             <wp:docPr id="1" name="Imagen 1"/>
             <wp:cNvGraphicFramePr>
               <a:graphicFrameLocks xmlns:a="http://schemas.openxmlformats.org/drawingml/2006/main" noChangeAspect="1"/>
@@ -199,7 +195,7 @@
                   <pic:spPr>
                     <a:xfrm>
                       <a:off x="0" y="0"/>
-                      <a:ext cx="5612130" cy="912495"/>
+                      <a:ext cx="5612130" cy="471805"/>
                     </a:xfrm>
                     <a:prstGeom prst="rect">
                       <a:avLst/>
@@ -263,16 +259,23 @@
       </w:r>
     </w:p>
     <w:p>
-      <w:r>
-        <w:t>http://localhost:8080/api/batch/procesar</w:t>
-      </w:r>
-    </w:p>
-    <w:p>
-      <w:r>
-        <w:t>o:</w:t>
-      </w:r>
-    </w:p>
-    <w:p>
+      <w:hyperlink r:id="rId6" w:history="1">
+        <w:r>
+          <w:rPr>
+            <w:rStyle w:val="Hipervnculo"/>
+          </w:rPr>
+          <w:t>http://localhost:8080/api/batch/procesar</w:t>
+        </w:r>
+      </w:hyperlink>
+      <w:r>
+        <w:t xml:space="preserve"> </w:t>
+      </w:r>
+      <w:r>
+        <w:t>o</w:t>
+      </w:r>
+      <w:r>
+        <w:t xml:space="preserve"> </w:t>
+      </w:r>
       <w:r>
         <w:t>http://localhost:8080/api/batch/estados-anuales</w:t>
       </w:r>
@@ -308,6 +311,7 @@
     </w:p>
     <w:p>
       <w:pPr>
+        <w:jc w:val="center"/>
         <w:rPr>
           <w:b/>
           <w:bCs/>
@@ -317,84 +321,11 @@
         <w:rPr>
           <w:noProof/>
         </w:rPr>
-        <w:lastRenderedPageBreak/>
         <w:drawing>
-          <wp:inline distT="0" distB="0" distL="0" distR="0" wp14:anchorId="3B896B1F" wp14:editId="21DF64C6">
-            <wp:extent cx="4568190" cy="3783565"/>
-            <wp:effectExtent l="0" t="0" r="3810" b="7620"/>
+          <wp:inline distT="0" distB="0" distL="0" distR="0" wp14:anchorId="3B896B1F" wp14:editId="57AF9467">
+            <wp:extent cx="3695700" cy="3060931"/>
+            <wp:effectExtent l="0" t="0" r="0" b="6350"/>
             <wp:docPr id="2" name="Imagen 2"/>
-            <wp:cNvGraphicFramePr>
-              <a:graphicFrameLocks xmlns:a="http://schemas.openxmlformats.org/drawingml/2006/main" noChangeAspect="1"/>
-            </wp:cNvGraphicFramePr>
-            <a:graphic xmlns:a="http://schemas.openxmlformats.org/drawingml/2006/main">
-              <a:graphicData uri="http://schemas.openxmlformats.org/drawingml/2006/picture">
-                <pic:pic xmlns:pic="http://schemas.openxmlformats.org/drawingml/2006/picture">
-                  <pic:nvPicPr>
-                    <pic:cNvPr id="1" name=""/>
-                    <pic:cNvPicPr/>
-                  </pic:nvPicPr>
-                  <pic:blipFill>
-                    <a:blip r:embed="rId6"/>
-                    <a:stretch>
-                      <a:fillRect/>
-                    </a:stretch>
-                  </pic:blipFill>
-                  <pic:spPr>
-                    <a:xfrm>
-                      <a:off x="0" y="0"/>
-                      <a:ext cx="4572275" cy="3786948"/>
-                    </a:xfrm>
-                    <a:prstGeom prst="rect">
-                      <a:avLst/>
-                    </a:prstGeom>
-                  </pic:spPr>
-                </pic:pic>
-              </a:graphicData>
-            </a:graphic>
-          </wp:inline>
-        </w:drawing>
-      </w:r>
-    </w:p>
-    <w:p>
-      <w:pPr>
-        <w:rPr>
-          <w:b/>
-          <w:bCs/>
-        </w:rPr>
-      </w:pPr>
-      <w:r>
-        <w:rPr>
-          <w:b/>
-          <w:bCs/>
-        </w:rPr>
-        <w:t xml:space="preserve">Evidencia 3. Finalización del procesamiento </w:t>
-      </w:r>
-      <w:proofErr w:type="spellStart"/>
-      <w:r>
-        <w:rPr>
-          <w:b/>
-          <w:bCs/>
-        </w:rPr>
-        <w:t>Batch</w:t>
-      </w:r>
-      <w:proofErr w:type="spellEnd"/>
-    </w:p>
-    <w:p>
-      <w:pPr>
-        <w:rPr>
-          <w:b/>
-          <w:bCs/>
-        </w:rPr>
-      </w:pPr>
-      <w:r>
-        <w:rPr>
-          <w:noProof/>
-        </w:rPr>
-        <w:drawing>
-          <wp:inline distT="0" distB="0" distL="0" distR="0" wp14:anchorId="26F2DF95" wp14:editId="7233A450">
-            <wp:extent cx="5612130" cy="1024255"/>
-            <wp:effectExtent l="0" t="0" r="7620" b="4445"/>
-            <wp:docPr id="3" name="Imagen 3"/>
             <wp:cNvGraphicFramePr>
               <a:graphicFrameLocks xmlns:a="http://schemas.openxmlformats.org/drawingml/2006/main" noChangeAspect="1"/>
             </wp:cNvGraphicFramePr>
@@ -414,7 +345,7 @@
                   <pic:spPr>
                     <a:xfrm>
                       <a:off x="0" y="0"/>
-                      <a:ext cx="5612130" cy="1024255"/>
+                      <a:ext cx="3732057" cy="3091043"/>
                     </a:xfrm>
                     <a:prstGeom prst="rect">
                       <a:avLst/>
@@ -428,128 +359,47 @@
       </w:r>
     </w:p>
     <w:p>
-      <w:r>
-        <w:t xml:space="preserve">Estas evidencias permiten comprobar que los datos necesarios para el funcionamiento de </w:t>
+      <w:pPr>
+        <w:rPr>
+          <w:b/>
+          <w:bCs/>
+        </w:rPr>
+      </w:pPr>
+      <w:r>
+        <w:rPr>
+          <w:b/>
+          <w:bCs/>
+        </w:rPr>
+        <w:lastRenderedPageBreak/>
+        <w:t xml:space="preserve">Evidencia 3. Finalización del procesamiento </w:t>
       </w:r>
       <w:proofErr w:type="spellStart"/>
       <w:r>
-        <w:t>Backend</w:t>
+        <w:rPr>
+          <w:b/>
+          <w:bCs/>
+        </w:rPr>
+        <w:t>Batch</w:t>
       </w:r>
       <w:proofErr w:type="spellEnd"/>
-      <w:r>
-        <w:t xml:space="preserve"> Core se encuentran previamente procesados y almacenados.</w:t>
-      </w:r>
-    </w:p>
-    <w:p>
-      <w:r>
-        <w:pict w14:anchorId="71F099C0">
-          <v:rect id="_x0000_i1180" style="width:0;height:1.5pt" o:hralign="center" o:hrstd="t" o:hr="t" fillcolor="#a0a0a0" stroked="f"/>
-        </w:pict>
-      </w:r>
-    </w:p>
-    <w:p>
-      <w:pPr>
-        <w:rPr>
-          <w:b/>
-          <w:bCs/>
-        </w:rPr>
-      </w:pPr>
-      <w:r>
-        <w:rPr>
-          <w:b/>
-          <w:bCs/>
-        </w:rPr>
-        <w:t xml:space="preserve">3. Integración y funcionamiento de </w:t>
-      </w:r>
-      <w:proofErr w:type="spellStart"/>
-      <w:r>
-        <w:rPr>
-          <w:b/>
-          <w:bCs/>
-        </w:rPr>
-        <w:t>Backend</w:t>
-      </w:r>
-      <w:proofErr w:type="spellEnd"/>
-      <w:r>
-        <w:rPr>
-          <w:b/>
-          <w:bCs/>
-        </w:rPr>
-        <w:t xml:space="preserve"> Core</w:t>
-      </w:r>
-    </w:p>
-    <w:p>
-      <w:r>
-        <w:t xml:space="preserve">Con la base de datos poblada, se inició </w:t>
-      </w:r>
-      <w:proofErr w:type="spellStart"/>
-      <w:r>
-        <w:t>Backend</w:t>
-      </w:r>
-      <w:proofErr w:type="spellEnd"/>
-      <w:r>
-        <w:t xml:space="preserve"> Core en el puerto 8081.</w:t>
-      </w:r>
-    </w:p>
-    <w:p>
-      <w:proofErr w:type="spellStart"/>
-      <w:r>
-        <w:t>Backend</w:t>
-      </w:r>
-      <w:proofErr w:type="spellEnd"/>
-      <w:r>
-        <w:t xml:space="preserve"> Core concentra las reglas de negocio y proporciona los servicios utilizados posteriormente por los BFF.</w:t>
-      </w:r>
-    </w:p>
-    <w:p>
-      <w:pPr>
-        <w:rPr>
-          <w:b/>
-          <w:bCs/>
-        </w:rPr>
-      </w:pPr>
-      <w:r>
-        <w:rPr>
-          <w:b/>
-          <w:bCs/>
-        </w:rPr>
-        <w:t xml:space="preserve">Evidencia 4. Consulta de cuenta mediante </w:t>
-      </w:r>
-      <w:proofErr w:type="spellStart"/>
-      <w:r>
-        <w:rPr>
-          <w:b/>
-          <w:bCs/>
-        </w:rPr>
-        <w:t>Backend</w:t>
-      </w:r>
-      <w:proofErr w:type="spellEnd"/>
-      <w:r>
-        <w:rPr>
-          <w:b/>
-          <w:bCs/>
-        </w:rPr>
-        <w:t xml:space="preserve"> Core</w:t>
-      </w:r>
-    </w:p>
-    <w:p>
-      <w:pPr>
-        <w:rPr>
-          <w:b/>
-          <w:bCs/>
-        </w:rPr>
-      </w:pPr>
-      <w:r>
-        <w:rPr>
-          <w:b/>
-          <w:bCs/>
-        </w:rPr>
-        <w:lastRenderedPageBreak/>
+    </w:p>
+    <w:p>
+      <w:pPr>
+        <w:rPr>
+          <w:b/>
+          <w:bCs/>
+        </w:rPr>
+      </w:pPr>
+      <w:r>
+        <w:rPr>
+          <w:b/>
+          <w:bCs/>
+        </w:rPr>
         <w:drawing>
-          <wp:inline distT="0" distB="0" distL="0" distR="0" wp14:anchorId="4BFF40F1" wp14:editId="72EB902A">
-            <wp:extent cx="5612130" cy="2811145"/>
-            <wp:effectExtent l="0" t="0" r="7620" b="8255"/>
-            <wp:docPr id="4" name="Imagen 4"/>
+          <wp:inline distT="0" distB="0" distL="0" distR="0" wp14:anchorId="3162211B" wp14:editId="4BF6855C">
+            <wp:extent cx="5612130" cy="1027430"/>
+            <wp:effectExtent l="0" t="0" r="7620" b="1270"/>
+            <wp:docPr id="28" name="Imagen 28"/>
             <wp:cNvGraphicFramePr>
               <a:graphicFrameLocks xmlns:a="http://schemas.openxmlformats.org/drawingml/2006/main" noChangeAspect="1"/>
             </wp:cNvGraphicFramePr>
@@ -569,7 +419,7 @@
                   <pic:spPr>
                     <a:xfrm>
                       <a:off x="0" y="0"/>
-                      <a:ext cx="5612130" cy="2811145"/>
+                      <a:ext cx="5612130" cy="1027430"/>
                     </a:xfrm>
                     <a:prstGeom prst="rect">
                       <a:avLst/>
@@ -583,29 +433,42 @@
       </w:r>
     </w:p>
     <w:p>
-      <w:pPr>
-        <w:rPr>
-          <w:b/>
-          <w:bCs/>
-        </w:rPr>
-      </w:pPr>
-      <w:r>
-        <w:rPr>
-          <w:b/>
-          <w:bCs/>
-        </w:rPr>
-        <w:t xml:space="preserve">Evidencia 5. Consulta de transacciones mediante </w:t>
+      <w:r>
+        <w:t xml:space="preserve">Estas evidencias permiten comprobar que los datos necesarios para el funcionamiento de </w:t>
       </w:r>
       <w:proofErr w:type="spellStart"/>
       <w:r>
-        <w:rPr>
-          <w:b/>
-          <w:bCs/>
-        </w:rPr>
         <w:t>Backend</w:t>
       </w:r>
       <w:proofErr w:type="spellEnd"/>
       <w:r>
+        <w:t xml:space="preserve"> Core se encuentran previamente procesados y almacenados.</w:t>
+      </w:r>
+    </w:p>
+    <w:p>
+      <w:pPr>
+        <w:rPr>
+          <w:b/>
+          <w:bCs/>
+        </w:rPr>
+      </w:pPr>
+      <w:r>
+        <w:rPr>
+          <w:b/>
+          <w:bCs/>
+        </w:rPr>
+        <w:t xml:space="preserve">3. Integración y funcionamiento de </w:t>
+      </w:r>
+      <w:proofErr w:type="spellStart"/>
+      <w:r>
+        <w:rPr>
+          <w:b/>
+          <w:bCs/>
+        </w:rPr>
+        <w:t>Backend</w:t>
+      </w:r>
+      <w:proofErr w:type="spellEnd"/>
+      <w:r>
         <w:rPr>
           <w:b/>
           <w:bCs/>
@@ -614,7 +477,62 @@
       </w:r>
     </w:p>
     <w:p>
-      <w:pPr>
+      <w:r>
+        <w:t xml:space="preserve">Con la base de datos poblada, se inició </w:t>
+      </w:r>
+      <w:proofErr w:type="spellStart"/>
+      <w:r>
+        <w:t>Backend</w:t>
+      </w:r>
+      <w:proofErr w:type="spellEnd"/>
+      <w:r>
+        <w:t xml:space="preserve"> Core en el puerto 8081.</w:t>
+      </w:r>
+    </w:p>
+    <w:p>
+      <w:proofErr w:type="spellStart"/>
+      <w:r>
+        <w:t>Backend</w:t>
+      </w:r>
+      <w:proofErr w:type="spellEnd"/>
+      <w:r>
+        <w:t xml:space="preserve"> Core concentra las reglas de negocio y proporciona los servicios utilizados posteriormente por los BFF.</w:t>
+      </w:r>
+    </w:p>
+    <w:p>
+      <w:pPr>
+        <w:rPr>
+          <w:b/>
+          <w:bCs/>
+        </w:rPr>
+      </w:pPr>
+      <w:r>
+        <w:rPr>
+          <w:b/>
+          <w:bCs/>
+        </w:rPr>
+        <w:t xml:space="preserve">Evidencia 4. Consulta de cuenta mediante </w:t>
+      </w:r>
+      <w:proofErr w:type="spellStart"/>
+      <w:r>
+        <w:rPr>
+          <w:b/>
+          <w:bCs/>
+        </w:rPr>
+        <w:t>Backend</w:t>
+      </w:r>
+      <w:proofErr w:type="spellEnd"/>
+      <w:r>
+        <w:rPr>
+          <w:b/>
+          <w:bCs/>
+        </w:rPr>
+        <w:t xml:space="preserve"> Core</w:t>
+      </w:r>
+    </w:p>
+    <w:p>
+      <w:pPr>
+        <w:jc w:val="center"/>
         <w:rPr>
           <w:b/>
           <w:bCs/>
@@ -626,10 +544,10 @@
           <w:bCs/>
         </w:rPr>
         <w:drawing>
-          <wp:inline distT="0" distB="0" distL="0" distR="0" wp14:anchorId="254C17CE" wp14:editId="420FCD89">
-            <wp:extent cx="5612130" cy="4514850"/>
-            <wp:effectExtent l="0" t="0" r="7620" b="0"/>
-            <wp:docPr id="5" name="Imagen 5"/>
+          <wp:inline distT="0" distB="0" distL="0" distR="0" wp14:anchorId="4BFF40F1" wp14:editId="5D9CA17E">
+            <wp:extent cx="5567758" cy="2788920"/>
+            <wp:effectExtent l="0" t="0" r="0" b="0"/>
+            <wp:docPr id="4" name="Imagen 4"/>
             <wp:cNvGraphicFramePr>
               <a:graphicFrameLocks xmlns:a="http://schemas.openxmlformats.org/drawingml/2006/main" noChangeAspect="1"/>
             </wp:cNvGraphicFramePr>
@@ -649,7 +567,7 @@
                   <pic:spPr>
                     <a:xfrm>
                       <a:off x="0" y="0"/>
-                      <a:ext cx="5612130" cy="4514850"/>
+                      <a:ext cx="5603981" cy="2807064"/>
                     </a:xfrm>
                     <a:prstGeom prst="rect">
                       <a:avLst/>
@@ -663,8 +581,18 @@
       </w:r>
     </w:p>
     <w:p>
-      <w:r>
-        <w:t>Esta evidencia es especialmente importante para la actividad BFF, ya que estas transacciones son posteriormente utilizadas por los BFF Web y Mobile para construir sus propias respuestas.</w:t>
+      <w:pPr>
+        <w:rPr>
+          <w:b/>
+          <w:bCs/>
+        </w:rPr>
+      </w:pPr>
+      <w:r>
+        <w:rPr>
+          <w:b/>
+          <w:bCs/>
+        </w:rPr>
+        <w:br w:type="page"/>
       </w:r>
     </w:p>
     <w:p>
@@ -680,7 +608,7 @@
           <w:bCs/>
         </w:rPr>
         <w:lastRenderedPageBreak/>
-        <w:t xml:space="preserve">Evidencia 6. Retiro mediante </w:t>
+        <w:t xml:space="preserve">Evidencia 5. Consulta de transacciones mediante </w:t>
       </w:r>
       <w:proofErr w:type="spellStart"/>
       <w:r>
@@ -701,6 +629,7 @@
     </w:p>
     <w:p>
       <w:pPr>
+        <w:jc w:val="center"/>
         <w:rPr>
           <w:b/>
           <w:bCs/>
@@ -712,10 +641,10 @@
           <w:bCs/>
         </w:rPr>
         <w:drawing>
-          <wp:inline distT="0" distB="0" distL="0" distR="0" wp14:anchorId="53E9ED6E" wp14:editId="6F9DFF01">
-            <wp:extent cx="5612130" cy="3230245"/>
-            <wp:effectExtent l="0" t="0" r="7620" b="8255"/>
-            <wp:docPr id="6" name="Imagen 6"/>
+          <wp:inline distT="0" distB="0" distL="0" distR="0" wp14:anchorId="254C17CE" wp14:editId="2D37AA17">
+            <wp:extent cx="4373880" cy="3518701"/>
+            <wp:effectExtent l="0" t="0" r="7620" b="5715"/>
+            <wp:docPr id="5" name="Imagen 5"/>
             <wp:cNvGraphicFramePr>
               <a:graphicFrameLocks xmlns:a="http://schemas.openxmlformats.org/drawingml/2006/main" noChangeAspect="1"/>
             </wp:cNvGraphicFramePr>
@@ -735,7 +664,7 @@
                   <pic:spPr>
                     <a:xfrm>
                       <a:off x="0" y="0"/>
-                      <a:ext cx="5612130" cy="3230245"/>
+                      <a:ext cx="4396441" cy="3536851"/>
                     </a:xfrm>
                     <a:prstGeom prst="rect">
                       <a:avLst/>
@@ -750,64 +679,58 @@
     </w:p>
     <w:p>
       <w:r>
-        <w:t xml:space="preserve">Esta evidencia permite comprobar que </w:t>
+        <w:t>Esta evidencia es especialmente importante para la actividad BFF, ya que estas transacciones son posteriormente utilizadas por los BFF Web y Mobile para construir sus propias respuestas.</w:t>
+      </w:r>
+    </w:p>
+    <w:p>
+      <w:pPr>
+        <w:rPr>
+          <w:b/>
+          <w:bCs/>
+        </w:rPr>
+      </w:pPr>
+      <w:r>
+        <w:rPr>
+          <w:b/>
+          <w:bCs/>
+        </w:rPr>
+        <w:t xml:space="preserve">Evidencia 6. Retiro mediante </w:t>
       </w:r>
       <w:proofErr w:type="spellStart"/>
       <w:r>
+        <w:rPr>
+          <w:b/>
+          <w:bCs/>
+        </w:rPr>
         <w:t>Backend</w:t>
       </w:r>
       <w:proofErr w:type="spellEnd"/>
       <w:r>
-        <w:t xml:space="preserve"> Core mantiene las reglas de negocio y ejecuta directamente la operación de retiro.</w:t>
-      </w:r>
-    </w:p>
-    <w:p>
-      <w:pPr>
-        <w:rPr>
-          <w:b/>
-          <w:bCs/>
-        </w:rPr>
-      </w:pPr>
-      <w:r>
-        <w:rPr>
-          <w:b/>
-          <w:bCs/>
-        </w:rPr>
-        <w:t>4. Funcionamiento y adaptación del BFF Web</w:t>
-      </w:r>
-    </w:p>
-    <w:p>
-      <w:r>
-        <w:t>El BFF Web se ejecuta en el puerto 8082 y está orientado a clientes que requieren una respuesta con mayor nivel de detalle.</w:t>
-      </w:r>
-    </w:p>
-    <w:p>
-      <w:pPr>
-        <w:rPr>
-          <w:b/>
-          <w:bCs/>
-        </w:rPr>
-      </w:pPr>
-      <w:r>
-        <w:rPr>
-          <w:b/>
-          <w:bCs/>
-        </w:rPr>
-        <w:t>Evidencia 7. Consulta detallada mediante BFF Web</w:t>
-      </w:r>
-    </w:p>
-    <w:p>
-      <w:r>
-        <w:rPr>
-          <w:b/>
-          <w:bCs/>
-        </w:rPr>
-        <w:lastRenderedPageBreak/>
+        <w:rPr>
+          <w:b/>
+          <w:bCs/>
+        </w:rPr>
+        <w:t xml:space="preserve"> Core</w:t>
+      </w:r>
+    </w:p>
+    <w:p>
+      <w:pPr>
+        <w:jc w:val="center"/>
+        <w:rPr>
+          <w:b/>
+          <w:bCs/>
+        </w:rPr>
+      </w:pPr>
+      <w:r>
+        <w:rPr>
+          <w:b/>
+          <w:bCs/>
+        </w:rPr>
         <w:drawing>
-          <wp:inline distT="0" distB="0" distL="0" distR="0" wp14:anchorId="2F983A96" wp14:editId="6885E80C">
-            <wp:extent cx="5612130" cy="4876800"/>
-            <wp:effectExtent l="0" t="0" r="7620" b="0"/>
-            <wp:docPr id="7" name="Imagen 7"/>
+          <wp:inline distT="0" distB="0" distL="0" distR="0" wp14:anchorId="53E9ED6E" wp14:editId="00C2E6A3">
+            <wp:extent cx="5017489" cy="2887980"/>
+            <wp:effectExtent l="0" t="0" r="0" b="7620"/>
+            <wp:docPr id="6" name="Imagen 6"/>
             <wp:cNvGraphicFramePr>
               <a:graphicFrameLocks xmlns:a="http://schemas.openxmlformats.org/drawingml/2006/main" noChangeAspect="1"/>
             </wp:cNvGraphicFramePr>
@@ -827,7 +750,7 @@
                   <pic:spPr>
                     <a:xfrm>
                       <a:off x="0" y="0"/>
-                      <a:ext cx="5612130" cy="4876800"/>
+                      <a:ext cx="5021630" cy="2890364"/>
                     </a:xfrm>
                     <a:prstGeom prst="rect">
                       <a:avLst/>
@@ -839,8 +762,10 @@
           </wp:inline>
         </w:drawing>
       </w:r>
-      <w:r>
-        <w:t xml:space="preserve">Esta evidencia permite comprobar que el BFF Web no entrega directamente la respuesta del </w:t>
+    </w:p>
+    <w:p>
+      <w:r>
+        <w:t xml:space="preserve">Esta evidencia permite comprobar que </w:t>
       </w:r>
       <w:proofErr w:type="spellStart"/>
       <w:r>
@@ -848,22 +773,7 @@
       </w:r>
       <w:proofErr w:type="spellEnd"/>
       <w:r>
-        <w:t xml:space="preserve"> Core, sino que adapta y organiza la información para el canal web.</w:t>
-      </w:r>
-    </w:p>
-    <w:p>
-      <w:pPr>
-        <w:rPr>
-          <w:b/>
-          <w:bCs/>
-        </w:rPr>
-      </w:pPr>
-      <w:r>
-        <w:rPr>
-          <w:b/>
-          <w:bCs/>
-        </w:rPr>
-        <w:t>Evidencia 8. Integración y agregación del BFF Web</w:t>
+        <w:t xml:space="preserve"> Core mantiene las reglas de negocio y ejecuta directamente la operación de retiro.</w:t>
       </w:r>
     </w:p>
     <w:p>
@@ -879,11 +789,43 @@
           <w:bCs/>
         </w:rPr>
         <w:lastRenderedPageBreak/>
+        <w:t>4. Funcionamiento y adaptación del BFF Web</w:t>
+      </w:r>
+    </w:p>
+    <w:p>
+      <w:r>
+        <w:t>El BFF Web se ejecuta en el puerto 8082 y está orientado a clientes que requieren una respuesta con mayor nivel de detalle.</w:t>
+      </w:r>
+    </w:p>
+    <w:p>
+      <w:pPr>
+        <w:rPr>
+          <w:b/>
+          <w:bCs/>
+        </w:rPr>
+      </w:pPr>
+      <w:r>
+        <w:rPr>
+          <w:b/>
+          <w:bCs/>
+        </w:rPr>
+        <w:t>Evidencia 7. Consulta detallada mediante BFF Web</w:t>
+      </w:r>
+    </w:p>
+    <w:p>
+      <w:pPr>
+        <w:jc w:val="center"/>
+      </w:pPr>
+      <w:r>
+        <w:rPr>
+          <w:b/>
+          <w:bCs/>
+        </w:rPr>
         <w:drawing>
-          <wp:inline distT="0" distB="0" distL="0" distR="0" wp14:anchorId="34C28E23" wp14:editId="489DEA29">
-            <wp:extent cx="5612130" cy="4054475"/>
-            <wp:effectExtent l="0" t="0" r="7620" b="3175"/>
-            <wp:docPr id="10" name="Imagen 10"/>
+          <wp:inline distT="0" distB="0" distL="0" distR="0" wp14:anchorId="2F983A96" wp14:editId="0D1983C7">
+            <wp:extent cx="3657600" cy="3178361"/>
+            <wp:effectExtent l="0" t="0" r="0" b="3175"/>
+            <wp:docPr id="7" name="Imagen 7"/>
             <wp:cNvGraphicFramePr>
               <a:graphicFrameLocks xmlns:a="http://schemas.openxmlformats.org/drawingml/2006/main" noChangeAspect="1"/>
             </wp:cNvGraphicFramePr>
@@ -903,7 +845,7 @@
                   <pic:spPr>
                     <a:xfrm>
                       <a:off x="0" y="0"/>
-                      <a:ext cx="5612130" cy="4054475"/>
+                      <a:ext cx="3670577" cy="3189638"/>
                     </a:xfrm>
                     <a:prstGeom prst="rect">
                       <a:avLst/>
@@ -918,7 +860,7 @@
     </w:p>
     <w:p>
       <w:r>
-        <w:t xml:space="preserve">Esta evidencia demuestra la integración y agregación de información proveniente de diferentes recursos del </w:t>
+        <w:t xml:space="preserve">Esta evidencia permite comprobar que el BFF Web no entrega directamente la respuesta del </w:t>
       </w:r>
       <w:proofErr w:type="spellStart"/>
       <w:r>
@@ -926,63 +868,42 @@
       </w:r>
       <w:proofErr w:type="spellEnd"/>
       <w:r>
-        <w:t xml:space="preserve"> Core.</w:t>
-      </w:r>
-    </w:p>
-    <w:p>
-      <w:r>
-        <w:pict w14:anchorId="687C4B5A">
-          <v:rect id="_x0000_i1182" style="width:0;height:1.5pt" o:hralign="center" o:hrstd="t" o:hr="t" fillcolor="#a0a0a0" stroked="f"/>
-        </w:pict>
-      </w:r>
-    </w:p>
-    <w:p>
-      <w:pPr>
-        <w:rPr>
-          <w:b/>
-          <w:bCs/>
-        </w:rPr>
-      </w:pPr>
-      <w:r>
-        <w:rPr>
-          <w:b/>
-          <w:bCs/>
-        </w:rPr>
-        <w:t>5. Funcionamiento y optimización del BFF Mobile</w:t>
-      </w:r>
-    </w:p>
-    <w:p>
-      <w:r>
-        <w:t>El BFF Mobile se ejecuta en el puerto 8083 y entrega únicamente la información necesaria para un dispositivo móvil.</w:t>
-      </w:r>
-    </w:p>
-    <w:p>
-      <w:pPr>
-        <w:rPr>
-          <w:b/>
-          <w:bCs/>
-        </w:rPr>
-      </w:pPr>
-      <w:r>
-        <w:rPr>
-          <w:b/>
-          <w:bCs/>
-        </w:rPr>
-        <w:t>Evidencia 9. Consulta mediante BFF Mobile</w:t>
-      </w:r>
-    </w:p>
-    <w:p>
-      <w:r>
-        <w:rPr>
-          <w:b/>
-          <w:bCs/>
-        </w:rPr>
-        <w:lastRenderedPageBreak/>
+        <w:t xml:space="preserve"> Core, sino que adapta y organiza la información para el canal web.</w:t>
+      </w:r>
+    </w:p>
+    <w:p>
+      <w:pPr>
+        <w:rPr>
+          <w:b/>
+          <w:bCs/>
+        </w:rPr>
+      </w:pPr>
+      <w:r>
+        <w:rPr>
+          <w:b/>
+          <w:bCs/>
+        </w:rPr>
+        <w:t>Evidencia 8. Integración y agregación del BFF Web</w:t>
+      </w:r>
+    </w:p>
+    <w:p>
+      <w:pPr>
+        <w:jc w:val="center"/>
+        <w:rPr>
+          <w:b/>
+          <w:bCs/>
+        </w:rPr>
+      </w:pPr>
+      <w:r>
+        <w:rPr>
+          <w:b/>
+          <w:bCs/>
+        </w:rPr>
         <w:drawing>
-          <wp:inline distT="0" distB="0" distL="0" distR="0" wp14:anchorId="559BB8CD" wp14:editId="74E33951">
-            <wp:extent cx="5612130" cy="4746625"/>
-            <wp:effectExtent l="0" t="0" r="7620" b="0"/>
-            <wp:docPr id="9" name="Imagen 9"/>
+          <wp:inline distT="0" distB="0" distL="0" distR="0" wp14:anchorId="34C28E23" wp14:editId="1BD57D2D">
+            <wp:extent cx="4168140" cy="3011266"/>
+            <wp:effectExtent l="0" t="0" r="3810" b="0"/>
+            <wp:docPr id="10" name="Imagen 10"/>
             <wp:cNvGraphicFramePr>
               <a:graphicFrameLocks xmlns:a="http://schemas.openxmlformats.org/drawingml/2006/main" noChangeAspect="1"/>
             </wp:cNvGraphicFramePr>
@@ -1002,7 +923,7 @@
                   <pic:spPr>
                     <a:xfrm>
                       <a:off x="0" y="0"/>
-                      <a:ext cx="5612130" cy="4746625"/>
+                      <a:ext cx="4177266" cy="3017859"/>
                     </a:xfrm>
                     <a:prstGeom prst="rect">
                       <a:avLst/>
@@ -1014,43 +935,70 @@
           </wp:inline>
         </w:drawing>
       </w:r>
-      <w:r>
-        <w:t>La respuesta debe permitir comprobar que el BFF Mobile entrega una estructura más liviana que la utilizada por el BFF Web.</w:t>
-      </w:r>
-    </w:p>
-    <w:p>
-      <w:pPr>
-        <w:rPr>
-          <w:b/>
-          <w:bCs/>
-        </w:rPr>
-      </w:pPr>
-      <w:r>
-        <w:rPr>
-          <w:b/>
-          <w:bCs/>
-        </w:rPr>
-        <w:t>Evidencia 10. Adaptación y optimización del BFF Mobile</w:t>
-      </w:r>
-    </w:p>
-    <w:p>
-      <w:pPr>
-        <w:rPr>
-          <w:b/>
-          <w:bCs/>
-        </w:rPr>
-      </w:pPr>
-      <w:r>
-        <w:rPr>
-          <w:b/>
-          <w:bCs/>
-        </w:rPr>
+    </w:p>
+    <w:p>
+      <w:r>
         <w:lastRenderedPageBreak/>
+        <w:t xml:space="preserve">Esta evidencia demuestra la integración y agregación de información proveniente de diferentes recursos del </w:t>
+      </w:r>
+      <w:proofErr w:type="spellStart"/>
+      <w:r>
+        <w:t>Backend</w:t>
+      </w:r>
+      <w:proofErr w:type="spellEnd"/>
+      <w:r>
+        <w:t xml:space="preserve"> Core.</w:t>
+      </w:r>
+    </w:p>
+    <w:p>
+      <w:pPr>
+        <w:rPr>
+          <w:b/>
+          <w:bCs/>
+        </w:rPr>
+      </w:pPr>
+      <w:r>
+        <w:rPr>
+          <w:b/>
+          <w:bCs/>
+        </w:rPr>
+        <w:t>5. Funcionamiento y optimización del BFF Mobile</w:t>
+      </w:r>
+    </w:p>
+    <w:p>
+      <w:r>
+        <w:t>El BFF Mobile se ejecuta en el puerto 8083 y entrega únicamente la información necesaria para un dispositivo móvil.</w:t>
+      </w:r>
+    </w:p>
+    <w:p>
+      <w:pPr>
+        <w:rPr>
+          <w:b/>
+          <w:bCs/>
+        </w:rPr>
+      </w:pPr>
+      <w:r>
+        <w:rPr>
+          <w:b/>
+          <w:bCs/>
+        </w:rPr>
+        <w:t>Evidencia 9. Consulta mediante BFF Mobile</w:t>
+      </w:r>
+    </w:p>
+    <w:p>
+      <w:pPr>
+        <w:jc w:val="center"/>
+      </w:pPr>
+      <w:r>
+        <w:rPr>
+          <w:b/>
+          <w:bCs/>
+        </w:rPr>
         <w:drawing>
-          <wp:inline distT="0" distB="0" distL="0" distR="0" wp14:anchorId="57536C24" wp14:editId="28778726">
-            <wp:extent cx="5612130" cy="3855085"/>
-            <wp:effectExtent l="0" t="0" r="7620" b="0"/>
-            <wp:docPr id="11" name="Imagen 11"/>
+          <wp:inline distT="0" distB="0" distL="0" distR="0" wp14:anchorId="559BB8CD" wp14:editId="175645E0">
+            <wp:extent cx="4408170" cy="3728340"/>
+            <wp:effectExtent l="0" t="0" r="0" b="5715"/>
+            <wp:docPr id="9" name="Imagen 9"/>
             <wp:cNvGraphicFramePr>
               <a:graphicFrameLocks xmlns:a="http://schemas.openxmlformats.org/drawingml/2006/main" noChangeAspect="1"/>
             </wp:cNvGraphicFramePr>
@@ -1070,7 +1018,7 @@
                   <pic:spPr>
                     <a:xfrm>
                       <a:off x="0" y="0"/>
-                      <a:ext cx="5612130" cy="3855085"/>
+                      <a:ext cx="4410002" cy="3729889"/>
                     </a:xfrm>
                     <a:prstGeom prst="rect">
                       <a:avLst/>
@@ -1085,54 +1033,33 @@
     </w:p>
     <w:p>
       <w:r>
-        <w:t xml:space="preserve">Esta evidencia demuestra que el BFF Mobile transforma y reduce la información recibida desde </w:t>
-      </w:r>
-      <w:proofErr w:type="spellStart"/>
-      <w:r>
-        <w:t>Backend</w:t>
-      </w:r>
-      <w:proofErr w:type="spellEnd"/>
-      <w:r>
-        <w:t xml:space="preserve"> Core antes de entregarla al cliente.</w:t>
-      </w:r>
-    </w:p>
-    <w:p>
-      <w:pPr>
-        <w:rPr>
-          <w:b/>
-          <w:bCs/>
-        </w:rPr>
-      </w:pPr>
-      <w:r>
-        <w:rPr>
-          <w:b/>
-          <w:bCs/>
-        </w:rPr>
-        <w:t>6. Funcionamiento del BFF ATM</w:t>
-      </w:r>
-    </w:p>
-    <w:p>
-      <w:r>
-        <w:t>El BFF ATM se ejecuta en el puerto 8084 y está orientado a operaciones críticas y esenciales de un cajero automático.</w:t>
-      </w:r>
-    </w:p>
-    <w:p>
-      <w:pPr>
-        <w:rPr>
-          <w:b/>
-          <w:bCs/>
-        </w:rPr>
-      </w:pPr>
-      <w:r>
-        <w:rPr>
-          <w:b/>
-          <w:bCs/>
-        </w:rPr>
-        <w:t>Evidencia 11. Consulta de saldo mediante BFF ATM</w:t>
-      </w:r>
-    </w:p>
-    <w:p>
-      <w:pPr>
+        <w:t>La respuesta debe permitir comprobar que el BFF Mobile entrega una estructura más liviana que la utilizada por el BFF Web.</w:t>
+      </w:r>
+    </w:p>
+    <w:p>
+      <w:r>
+        <w:br w:type="page"/>
+      </w:r>
+    </w:p>
+    <w:p>
+      <w:pPr>
+        <w:rPr>
+          <w:b/>
+          <w:bCs/>
+        </w:rPr>
+      </w:pPr>
+      <w:r>
+        <w:rPr>
+          <w:b/>
+          <w:bCs/>
+        </w:rPr>
+        <w:lastRenderedPageBreak/>
+        <w:t>Evidencia 10. Adaptación y optimización del BFF Mobile</w:t>
+      </w:r>
+    </w:p>
+    <w:p>
+      <w:pPr>
+        <w:jc w:val="center"/>
         <w:rPr>
           <w:b/>
           <w:bCs/>
@@ -1144,10 +1071,10 @@
           <w:bCs/>
         </w:rPr>
         <w:drawing>
-          <wp:inline distT="0" distB="0" distL="0" distR="0" wp14:anchorId="6FB4A55A" wp14:editId="65AE42EF">
-            <wp:extent cx="5612130" cy="2121535"/>
+          <wp:inline distT="0" distB="0" distL="0" distR="0" wp14:anchorId="57536C24" wp14:editId="1153B54C">
+            <wp:extent cx="4469130" cy="3069935"/>
             <wp:effectExtent l="0" t="0" r="7620" b="0"/>
-            <wp:docPr id="12" name="Imagen 12"/>
+            <wp:docPr id="11" name="Imagen 11"/>
             <wp:cNvGraphicFramePr>
               <a:graphicFrameLocks xmlns:a="http://schemas.openxmlformats.org/drawingml/2006/main" noChangeAspect="1"/>
             </wp:cNvGraphicFramePr>
@@ -1167,7 +1094,7 @@
                   <pic:spPr>
                     <a:xfrm>
                       <a:off x="0" y="0"/>
-                      <a:ext cx="5612130" cy="2121535"/>
+                      <a:ext cx="4473592" cy="3073000"/>
                     </a:xfrm>
                     <a:prstGeom prst="rect">
                       <a:avLst/>
@@ -1182,36 +1109,69 @@
     </w:p>
     <w:p>
       <w:r>
-        <w:t>La respuesta debe ser mínima y contener únicamente la información necesaria para la consulta de saldo.</w:t>
-      </w:r>
-    </w:p>
-    <w:p>
-      <w:pPr>
-        <w:rPr>
-          <w:b/>
-          <w:bCs/>
-        </w:rPr>
-      </w:pPr>
-      <w:r>
-        <w:rPr>
-          <w:b/>
-          <w:bCs/>
-        </w:rPr>
-        <w:lastRenderedPageBreak/>
-        <w:t>Evidencia 12. Retiro mediante BFF ATM</w:t>
-      </w:r>
-    </w:p>
-    <w:p>
+        <w:t xml:space="preserve">Esta evidencia demuestra que el BFF Mobile transforma y reduce la información recibida desde </w:t>
+      </w:r>
+      <w:proofErr w:type="spellStart"/>
+      <w:r>
+        <w:t>Backend</w:t>
+      </w:r>
+      <w:proofErr w:type="spellEnd"/>
+      <w:r>
+        <w:t xml:space="preserve"> Core antes de entregarla al cliente.</w:t>
+      </w:r>
+    </w:p>
+    <w:p>
+      <w:pPr>
+        <w:rPr>
+          <w:b/>
+          <w:bCs/>
+        </w:rPr>
+      </w:pPr>
+      <w:r>
+        <w:rPr>
+          <w:b/>
+          <w:bCs/>
+        </w:rPr>
+        <w:t>6. Funcionamiento del BFF ATM</w:t>
+      </w:r>
+    </w:p>
+    <w:p>
+      <w:r>
+        <w:t>El BFF ATM se ejecuta en el puerto 8084 y está orientado a operaciones críticas y esenciales de un cajero automático.</w:t>
+      </w:r>
+    </w:p>
+    <w:p>
+      <w:pPr>
+        <w:rPr>
+          <w:b/>
+          <w:bCs/>
+        </w:rPr>
+      </w:pPr>
+      <w:r>
+        <w:rPr>
+          <w:b/>
+          <w:bCs/>
+        </w:rPr>
+        <w:t>Evidencia 11. Consulta de saldo mediante BFF ATM</w:t>
+      </w:r>
+    </w:p>
+    <w:p>
+      <w:pPr>
+        <w:rPr>
+          <w:b/>
+          <w:bCs/>
+        </w:rPr>
+      </w:pPr>
       <w:r>
         <w:rPr>
           <w:b/>
           <w:bCs/>
         </w:rPr>
         <w:drawing>
-          <wp:inline distT="0" distB="0" distL="0" distR="0" wp14:anchorId="1D31E732" wp14:editId="10AE32F0">
-            <wp:extent cx="5612130" cy="3302635"/>
+          <wp:inline distT="0" distB="0" distL="0" distR="0" wp14:anchorId="6FB4A55A" wp14:editId="65AE42EF">
+            <wp:extent cx="5612130" cy="2121535"/>
             <wp:effectExtent l="0" t="0" r="7620" b="0"/>
-            <wp:docPr id="13" name="Imagen 13"/>
+            <wp:docPr id="12" name="Imagen 12"/>
             <wp:cNvGraphicFramePr>
               <a:graphicFrameLocks xmlns:a="http://schemas.openxmlformats.org/drawingml/2006/main" noChangeAspect="1"/>
             </wp:cNvGraphicFramePr>
@@ -1231,7 +1191,7 @@
                   <pic:spPr>
                     <a:xfrm>
                       <a:off x="0" y="0"/>
-                      <a:ext cx="5612130" cy="3302635"/>
+                      <a:ext cx="5612130" cy="2121535"/>
                     </a:xfrm>
                     <a:prstGeom prst="rect">
                       <a:avLst/>
@@ -1245,6 +1205,78 @@
       </w:r>
     </w:p>
     <w:p>
+      <w:r>
+        <w:t>La respuesta debe ser mínima y contener únicamente la información necesaria para la consulta de saldo.</w:t>
+      </w:r>
+    </w:p>
+    <w:p>
+      <w:r>
+        <w:br w:type="page"/>
+      </w:r>
+    </w:p>
+    <w:p>
+      <w:pPr>
+        <w:rPr>
+          <w:b/>
+          <w:bCs/>
+        </w:rPr>
+      </w:pPr>
+      <w:r>
+        <w:rPr>
+          <w:b/>
+          <w:bCs/>
+        </w:rPr>
+        <w:lastRenderedPageBreak/>
+        <w:t>Evidencia 12. Retiro mediante BFF ATM</w:t>
+      </w:r>
+    </w:p>
+    <w:p>
+      <w:pPr>
+        <w:jc w:val="center"/>
+      </w:pPr>
+      <w:r>
+        <w:rPr>
+          <w:b/>
+          <w:bCs/>
+        </w:rPr>
+        <w:drawing>
+          <wp:inline distT="0" distB="0" distL="0" distR="0" wp14:anchorId="1D31E732" wp14:editId="064E2B90">
+            <wp:extent cx="4674870" cy="2751075"/>
+            <wp:effectExtent l="0" t="0" r="0" b="0"/>
+            <wp:docPr id="13" name="Imagen 13"/>
+            <wp:cNvGraphicFramePr>
+              <a:graphicFrameLocks xmlns:a="http://schemas.openxmlformats.org/drawingml/2006/main" noChangeAspect="1"/>
+            </wp:cNvGraphicFramePr>
+            <a:graphic xmlns:a="http://schemas.openxmlformats.org/drawingml/2006/main">
+              <a:graphicData uri="http://schemas.openxmlformats.org/drawingml/2006/picture">
+                <pic:pic xmlns:pic="http://schemas.openxmlformats.org/drawingml/2006/picture">
+                  <pic:nvPicPr>
+                    <pic:cNvPr id="1" name=""/>
+                    <pic:cNvPicPr/>
+                  </pic:nvPicPr>
+                  <pic:blipFill>
+                    <a:blip r:embed="rId17"/>
+                    <a:stretch>
+                      <a:fillRect/>
+                    </a:stretch>
+                  </pic:blipFill>
+                  <pic:spPr>
+                    <a:xfrm>
+                      <a:off x="0" y="0"/>
+                      <a:ext cx="4680201" cy="2754212"/>
+                    </a:xfrm>
+                    <a:prstGeom prst="rect">
+                      <a:avLst/>
+                    </a:prstGeom>
+                  </pic:spPr>
+                </pic:pic>
+              </a:graphicData>
+            </a:graphic>
+          </wp:inline>
+        </w:drawing>
+      </w:r>
+    </w:p>
+    <w:p>
       <w:pPr>
         <w:rPr>
           <w:b/>
@@ -1281,9 +1313,9 @@
         <w:tblLook w:val="04A0" w:firstRow="1" w:lastRow="0" w:firstColumn="1" w:lastColumn="0" w:noHBand="0" w:noVBand="1"/>
       </w:tblPr>
       <w:tblGrid>
-        <w:gridCol w:w="3048"/>
-        <w:gridCol w:w="3048"/>
-        <w:gridCol w:w="2732"/>
+        <w:gridCol w:w="3056"/>
+        <w:gridCol w:w="3041"/>
+        <w:gridCol w:w="2731"/>
       </w:tblGrid>
       <w:tr>
         <w:tc>
@@ -1358,9 +1390,9 @@
           <w:p>
             <w:r>
               <w:drawing>
-                <wp:inline distT="0" distB="0" distL="0" distR="0" wp14:anchorId="2F6AC8C4" wp14:editId="19F99762">
-                  <wp:extent cx="1981200" cy="3233564"/>
-                  <wp:effectExtent l="0" t="0" r="0" b="5080"/>
+                <wp:inline distT="0" distB="0" distL="0" distR="0" wp14:anchorId="2F6AC8C4" wp14:editId="02967936">
+                  <wp:extent cx="1956212" cy="3192780"/>
+                  <wp:effectExtent l="0" t="0" r="6350" b="7620"/>
                   <wp:docPr id="15" name="Imagen 15"/>
                   <wp:cNvGraphicFramePr>
                     <a:graphicFrameLocks xmlns:a="http://schemas.openxmlformats.org/drawingml/2006/main" noChangeAspect="1"/>
@@ -1373,7 +1405,7 @@
                           <pic:cNvPicPr/>
                         </pic:nvPicPr>
                         <pic:blipFill>
-                          <a:blip r:embed="rId17"/>
+                          <a:blip r:embed="rId18"/>
                           <a:stretch>
                             <a:fillRect/>
                           </a:stretch>
@@ -1381,7 +1413,7 @@
                         <pic:spPr>
                           <a:xfrm>
                             <a:off x="0" y="0"/>
-                            <a:ext cx="1987784" cy="3244309"/>
+                            <a:ext cx="1979407" cy="3230637"/>
                           </a:xfrm>
                           <a:prstGeom prst="rect">
                             <a:avLst/>
@@ -1402,9 +1434,9 @@
           <w:p>
             <w:r>
               <w:drawing>
-                <wp:inline distT="0" distB="0" distL="0" distR="0" wp14:anchorId="373D1E91" wp14:editId="5E0C4313">
-                  <wp:extent cx="1976971" cy="3233420"/>
-                  <wp:effectExtent l="0" t="0" r="4445" b="5080"/>
+                <wp:inline distT="0" distB="0" distL="0" distR="0" wp14:anchorId="373D1E91" wp14:editId="6884058E">
+                  <wp:extent cx="1952124" cy="3192780"/>
+                  <wp:effectExtent l="0" t="0" r="0" b="7620"/>
                   <wp:docPr id="16" name="Imagen 16"/>
                   <wp:cNvGraphicFramePr>
                     <a:graphicFrameLocks xmlns:a="http://schemas.openxmlformats.org/drawingml/2006/main" noChangeAspect="1"/>
@@ -1417,7 +1449,7 @@
                           <pic:cNvPicPr/>
                         </pic:nvPicPr>
                         <pic:blipFill>
-                          <a:blip r:embed="rId18"/>
+                          <a:blip r:embed="rId19"/>
                           <a:stretch>
                             <a:fillRect/>
                           </a:stretch>
@@ -1425,7 +1457,7 @@
                         <pic:spPr>
                           <a:xfrm>
                             <a:off x="0" y="0"/>
-                            <a:ext cx="1983482" cy="3244069"/>
+                            <a:ext cx="1998596" cy="3268787"/>
                           </a:xfrm>
                           <a:prstGeom prst="rect">
                             <a:avLst/>
@@ -1446,9 +1478,9 @@
           <w:p>
             <w:r>
               <w:drawing>
-                <wp:inline distT="0" distB="0" distL="0" distR="0" wp14:anchorId="5D427FFC" wp14:editId="4BAE9AF5">
-                  <wp:extent cx="1760220" cy="687054"/>
-                  <wp:effectExtent l="0" t="0" r="0" b="0"/>
+                <wp:inline distT="0" distB="0" distL="0" distR="0" wp14:anchorId="5D427FFC" wp14:editId="484BF993">
+                  <wp:extent cx="1737485" cy="678180"/>
+                  <wp:effectExtent l="0" t="0" r="0" b="7620"/>
                   <wp:docPr id="17" name="Imagen 17"/>
                   <wp:cNvGraphicFramePr>
                     <a:graphicFrameLocks xmlns:a="http://schemas.openxmlformats.org/drawingml/2006/main" noChangeAspect="1"/>
@@ -1461,7 +1493,7 @@
                           <pic:cNvPicPr/>
                         </pic:nvPicPr>
                         <pic:blipFill>
-                          <a:blip r:embed="rId19"/>
+                          <a:blip r:embed="rId20"/>
                           <a:stretch>
                             <a:fillRect/>
                           </a:stretch>
@@ -1469,7 +1501,7 @@
                         <pic:spPr>
                           <a:xfrm>
                             <a:off x="0" y="0"/>
-                            <a:ext cx="1784214" cy="696419"/>
+                            <a:ext cx="1782223" cy="695642"/>
                           </a:xfrm>
                           <a:prstGeom prst="rect">
                             <a:avLst/>
@@ -1484,149 +1516,32 @@
           </w:p>
         </w:tc>
       </w:tr>
-    </w:tbl>
-    <w:p/>
-    <w:tbl>
-      <w:tblPr>
-        <w:tblStyle w:val="Tablaconcuadrcula"/>
-        <w:tblW w:w="0" w:type="auto"/>
-        <w:tblLook w:val="04A0" w:firstRow="1" w:lastRow="0" w:firstColumn="1" w:lastColumn="0" w:noHBand="0" w:noVBand="1"/>
-      </w:tblPr>
-      <w:tblGrid>
-        <w:gridCol w:w="847"/>
-        <w:gridCol w:w="5597"/>
-      </w:tblGrid>
       <w:tr>
         <w:tc>
           <w:tcPr>
-            <w:tcW w:w="0" w:type="auto"/>
-            <w:hideMark/>
+            <w:tcW w:w="3048" w:type="dxa"/>
           </w:tcPr>
           <w:p>
-            <w:pPr>
-              <w:spacing w:after="160" w:line="259" w:lineRule="auto"/>
-              <w:rPr>
-                <w:b/>
-                <w:bCs/>
-              </w:rPr>
-            </w:pPr>
             <w:r>
-              <w:rPr>
-                <w:b/>
-                <w:bCs/>
-              </w:rPr>
-              <w:lastRenderedPageBreak/>
-              <w:t>BFF</w:t>
+              <w:t>Información completa de la cuenta, resumen y movimientos</w:t>
             </w:r>
           </w:p>
         </w:tc>
         <w:tc>
           <w:tcPr>
-            <w:tcW w:w="0" w:type="auto"/>
-            <w:hideMark/>
+            <w:tcW w:w="3048" w:type="dxa"/>
           </w:tcPr>
           <w:p>
-            <w:pPr>
-              <w:spacing w:after="160" w:line="259" w:lineRule="auto"/>
-              <w:rPr>
-                <w:b/>
-                <w:bCs/>
-              </w:rPr>
-            </w:pPr>
             <w:r>
-              <w:rPr>
-                <w:b/>
-                <w:bCs/>
-              </w:rPr>
-              <w:t>Información entregada</w:t>
-            </w:r>
-          </w:p>
-        </w:tc>
-      </w:tr>
-      <w:tr>
-        <w:tc>
-          <w:tcPr>
-            <w:tcW w:w="0" w:type="auto"/>
-            <w:hideMark/>
-          </w:tcPr>
-          <w:p>
-            <w:pPr>
-              <w:spacing w:after="160" w:line="259" w:lineRule="auto"/>
-            </w:pPr>
-            <w:r>
-              <w:t>Web</w:t>
+              <w:t>Información esencial, saldo y últimos movimientos</w:t>
             </w:r>
           </w:p>
         </w:tc>
         <w:tc>
           <w:tcPr>
-            <w:tcW w:w="0" w:type="auto"/>
-            <w:hideMark/>
+            <w:tcW w:w="2732" w:type="dxa"/>
           </w:tcPr>
           <w:p>
-            <w:pPr>
-              <w:spacing w:after="160" w:line="259" w:lineRule="auto"/>
-            </w:pPr>
-            <w:r>
-              <w:t>Información completa de la cuenta, resumen y movimientos</w:t>
-            </w:r>
-          </w:p>
-        </w:tc>
-      </w:tr>
-      <w:tr>
-        <w:tc>
-          <w:tcPr>
-            <w:tcW w:w="0" w:type="auto"/>
-            <w:hideMark/>
-          </w:tcPr>
-          <w:p>
-            <w:pPr>
-              <w:spacing w:after="160" w:line="259" w:lineRule="auto"/>
-            </w:pPr>
-            <w:r>
-              <w:t>Mobile</w:t>
-            </w:r>
-          </w:p>
-        </w:tc>
-        <w:tc>
-          <w:tcPr>
-            <w:tcW w:w="0" w:type="auto"/>
-            <w:hideMark/>
-          </w:tcPr>
-          <w:p>
-            <w:pPr>
-              <w:spacing w:after="160" w:line="259" w:lineRule="auto"/>
-            </w:pPr>
-            <w:r>
-              <w:t>Información esencial, saldo y últimos movimientos</w:t>
-            </w:r>
-          </w:p>
-        </w:tc>
-      </w:tr>
-      <w:tr>
-        <w:tc>
-          <w:tcPr>
-            <w:tcW w:w="0" w:type="auto"/>
-            <w:hideMark/>
-          </w:tcPr>
-          <w:p>
-            <w:pPr>
-              <w:spacing w:after="160" w:line="259" w:lineRule="auto"/>
-            </w:pPr>
-            <w:r>
-              <w:t>ATM</w:t>
-            </w:r>
-          </w:p>
-        </w:tc>
-        <w:tc>
-          <w:tcPr>
-            <w:tcW w:w="0" w:type="auto"/>
-            <w:hideMark/>
-          </w:tcPr>
-          <w:p>
-            <w:pPr>
-              <w:spacing w:after="160" w:line="259" w:lineRule="auto"/>
-            </w:pPr>
             <w:r>
               <w:t>Identificador, saldo y respuesta específica para retiros</w:t>
             </w:r>
@@ -1651,6 +1566,7 @@
           <w:b/>
           <w:bCs/>
         </w:rPr>
+        <w:lastRenderedPageBreak/>
         <w:t>8. Configuración de comunicación y tiempos de espera</w:t>
       </w:r>
     </w:p>
@@ -1701,119 +1617,6 @@
             <wp:extent cx="5547841" cy="1082134"/>
             <wp:effectExtent l="0" t="0" r="0" b="3810"/>
             <wp:docPr id="18" name="Imagen 18"/>
-            <wp:cNvGraphicFramePr>
-              <a:graphicFrameLocks xmlns:a="http://schemas.openxmlformats.org/drawingml/2006/main" noChangeAspect="1"/>
-            </wp:cNvGraphicFramePr>
-            <a:graphic xmlns:a="http://schemas.openxmlformats.org/drawingml/2006/main">
-              <a:graphicData uri="http://schemas.openxmlformats.org/drawingml/2006/picture">
-                <pic:pic xmlns:pic="http://schemas.openxmlformats.org/drawingml/2006/picture">
-                  <pic:nvPicPr>
-                    <pic:cNvPr id="1" name=""/>
-                    <pic:cNvPicPr/>
-                  </pic:nvPicPr>
-                  <pic:blipFill>
-                    <a:blip r:embed="rId20"/>
-                    <a:stretch>
-                      <a:fillRect/>
-                    </a:stretch>
-                  </pic:blipFill>
-                  <pic:spPr>
-                    <a:xfrm>
-                      <a:off x="0" y="0"/>
-                      <a:ext cx="5547841" cy="1082134"/>
-                    </a:xfrm>
-                    <a:prstGeom prst="rect">
-                      <a:avLst/>
-                    </a:prstGeom>
-                  </pic:spPr>
-                </pic:pic>
-              </a:graphicData>
-            </a:graphic>
-          </wp:inline>
-        </w:drawing>
-      </w:r>
-    </w:p>
-    <w:p>
-      <w:r>
-        <w:t xml:space="preserve">Esta configuración demuestra que los BFF utilizan comunicación HTTP mediante </w:t>
-      </w:r>
-      <w:proofErr w:type="spellStart"/>
-      <w:r>
-        <w:t>Feign</w:t>
-      </w:r>
-      <w:proofErr w:type="spellEnd"/>
-      <w:r>
-        <w:t xml:space="preserve"> y que se establecen límites de tiempo para las llamadas al </w:t>
-      </w:r>
-      <w:proofErr w:type="spellStart"/>
-      <w:r>
-        <w:t>Backend</w:t>
-      </w:r>
-      <w:proofErr w:type="spellEnd"/>
-      <w:r>
-        <w:t xml:space="preserve"> Core.</w:t>
-      </w:r>
-    </w:p>
-    <w:p>
-      <w:pPr>
-        <w:rPr>
-          <w:b/>
-          <w:bCs/>
-        </w:rPr>
-      </w:pPr>
-      <w:r>
-        <w:rPr>
-          <w:b/>
-          <w:bCs/>
-        </w:rPr>
-        <w:t>9. Manejo de errores</w:t>
-      </w:r>
-    </w:p>
-    <w:p>
-      <w:r>
-        <w:t xml:space="preserve">Las siguientes pruebas permiten comprobar que los errores provenientes del </w:t>
-      </w:r>
-      <w:proofErr w:type="spellStart"/>
-      <w:r>
-        <w:t>Backend</w:t>
-      </w:r>
-      <w:proofErr w:type="spellEnd"/>
-      <w:r>
-        <w:t xml:space="preserve"> Core son correctamente adaptados por los BFF.</w:t>
-      </w:r>
-    </w:p>
-    <w:p>
-      <w:pPr>
-        <w:rPr>
-          <w:b/>
-          <w:bCs/>
-        </w:rPr>
-      </w:pPr>
-      <w:r>
-        <w:rPr>
-          <w:b/>
-          <w:bCs/>
-        </w:rPr>
-        <w:t>Evidencia 15. Cuenta inexistente</w:t>
-      </w:r>
-    </w:p>
-    <w:p>
-      <w:pPr>
-        <w:rPr>
-          <w:b/>
-          <w:bCs/>
-        </w:rPr>
-      </w:pPr>
-      <w:r>
-        <w:rPr>
-          <w:b/>
-          <w:bCs/>
-        </w:rPr>
-        <w:drawing>
-          <wp:inline distT="0" distB="0" distL="0" distR="0" wp14:anchorId="0A2DB283" wp14:editId="341042F4">
-            <wp:extent cx="5612130" cy="2273935"/>
-            <wp:effectExtent l="0" t="0" r="7620" b="0"/>
-            <wp:docPr id="19" name="Imagen 19"/>
             <wp:cNvGraphicFramePr>
               <a:graphicFrameLocks xmlns:a="http://schemas.openxmlformats.org/drawingml/2006/main" noChangeAspect="1"/>
             </wp:cNvGraphicFramePr>
@@ -1833,7 +1636,7 @@
                   <pic:spPr>
                     <a:xfrm>
                       <a:off x="0" y="0"/>
-                      <a:ext cx="5612130" cy="2273935"/>
+                      <a:ext cx="5547841" cy="1082134"/>
                     </a:xfrm>
                     <a:prstGeom prst="rect">
                       <a:avLst/>
@@ -1845,32 +1648,89 @@
           </wp:inline>
         </w:drawing>
       </w:r>
-      <w:r>
-        <w:rPr>
-          <w:b/>
-          <w:bCs/>
-        </w:rPr>
-        <w:t>Evidencia 16. Monto inválido</w:t>
-      </w:r>
-    </w:p>
-    <w:p>
-      <w:pPr>
-        <w:rPr>
-          <w:b/>
-          <w:bCs/>
-        </w:rPr>
-      </w:pPr>
-      <w:r>
-        <w:rPr>
-          <w:b/>
-          <w:bCs/>
-        </w:rPr>
-        <w:lastRenderedPageBreak/>
+    </w:p>
+    <w:p>
+      <w:r>
+        <w:t xml:space="preserve">Esta configuración demuestra que los BFF utilizan comunicación HTTP mediante </w:t>
+      </w:r>
+      <w:proofErr w:type="spellStart"/>
+      <w:r>
+        <w:t>Feign</w:t>
+      </w:r>
+      <w:proofErr w:type="spellEnd"/>
+      <w:r>
+        <w:t xml:space="preserve"> y que se establecen límites de tiempo para las llamadas al </w:t>
+      </w:r>
+      <w:proofErr w:type="spellStart"/>
+      <w:r>
+        <w:t>Backend</w:t>
+      </w:r>
+      <w:proofErr w:type="spellEnd"/>
+      <w:r>
+        <w:t xml:space="preserve"> Core.</w:t>
+      </w:r>
+    </w:p>
+    <w:p>
+      <w:pPr>
+        <w:rPr>
+          <w:b/>
+          <w:bCs/>
+        </w:rPr>
+      </w:pPr>
+      <w:r>
+        <w:rPr>
+          <w:b/>
+          <w:bCs/>
+        </w:rPr>
+        <w:t>9. Manejo de errores</w:t>
+      </w:r>
+    </w:p>
+    <w:p>
+      <w:r>
+        <w:t xml:space="preserve">Las siguientes pruebas permiten comprobar que los errores provenientes del </w:t>
+      </w:r>
+      <w:proofErr w:type="spellStart"/>
+      <w:r>
+        <w:t>Backend</w:t>
+      </w:r>
+      <w:proofErr w:type="spellEnd"/>
+      <w:r>
+        <w:t xml:space="preserve"> Core son correctamente adaptados por los BFF.</w:t>
+      </w:r>
+    </w:p>
+    <w:p>
+      <w:pPr>
+        <w:rPr>
+          <w:b/>
+          <w:bCs/>
+        </w:rPr>
+      </w:pPr>
+      <w:r>
+        <w:rPr>
+          <w:b/>
+          <w:bCs/>
+        </w:rPr>
+        <w:t>Evidencia 15. Cuenta inexistente</w:t>
+      </w:r>
+    </w:p>
+    <w:p>
+      <w:pPr>
+        <w:jc w:val="center"/>
+        <w:rPr>
+          <w:b/>
+          <w:bCs/>
+        </w:rPr>
+      </w:pPr>
+      <w:r>
+        <w:rPr>
+          <w:b/>
+          <w:bCs/>
+        </w:rPr>
         <w:drawing>
-          <wp:inline distT="0" distB="0" distL="0" distR="0" wp14:anchorId="4F2A8928" wp14:editId="5C29E877">
-            <wp:extent cx="5612130" cy="3457575"/>
-            <wp:effectExtent l="0" t="0" r="7620" b="9525"/>
-            <wp:docPr id="20" name="Imagen 20"/>
+          <wp:inline distT="0" distB="0" distL="0" distR="0" wp14:anchorId="0A2DB283" wp14:editId="7E2673E3">
+            <wp:extent cx="4643005" cy="1881263"/>
+            <wp:effectExtent l="0" t="0" r="5715" b="5080"/>
+            <wp:docPr id="19" name="Imagen 19"/>
             <wp:cNvGraphicFramePr>
               <a:graphicFrameLocks xmlns:a="http://schemas.openxmlformats.org/drawingml/2006/main" noChangeAspect="1"/>
             </wp:cNvGraphicFramePr>
@@ -1890,7 +1750,7 @@
                   <pic:spPr>
                     <a:xfrm>
                       <a:off x="0" y="0"/>
-                      <a:ext cx="5612130" cy="3457575"/>
+                      <a:ext cx="4659702" cy="1888028"/>
                     </a:xfrm>
                     <a:prstGeom prst="rect">
                       <a:avLst/>
@@ -1902,16 +1762,25 @@
           </wp:inline>
         </w:drawing>
       </w:r>
-      <w:r>
-        <w:rPr>
-          <w:b/>
-          <w:bCs/>
-        </w:rPr>
-        <w:t>Evidencia 17. Saldo insuficiente</w:t>
-      </w:r>
-    </w:p>
-    <w:p>
-      <w:pPr>
+    </w:p>
+    <w:p>
+      <w:pPr>
+        <w:rPr>
+          <w:b/>
+          <w:bCs/>
+        </w:rPr>
+      </w:pPr>
+      <w:r>
+        <w:rPr>
+          <w:b/>
+          <w:bCs/>
+        </w:rPr>
+        <w:t>Evidencia 16. Monto inválido</w:t>
+      </w:r>
+    </w:p>
+    <w:p>
+      <w:pPr>
+        <w:jc w:val="center"/>
         <w:rPr>
           <w:b/>
           <w:bCs/>
@@ -1923,10 +1792,10 @@
           <w:bCs/>
         </w:rPr>
         <w:drawing>
-          <wp:inline distT="0" distB="0" distL="0" distR="0" wp14:anchorId="30334D66" wp14:editId="419F1C66">
-            <wp:extent cx="5612130" cy="3493770"/>
-            <wp:effectExtent l="0" t="0" r="7620" b="0"/>
-            <wp:docPr id="21" name="Imagen 21"/>
+          <wp:inline distT="0" distB="0" distL="0" distR="0" wp14:anchorId="4F2A8928" wp14:editId="37C6A399">
+            <wp:extent cx="4304178" cy="2651760"/>
+            <wp:effectExtent l="0" t="0" r="1270" b="0"/>
+            <wp:docPr id="20" name="Imagen 20"/>
             <wp:cNvGraphicFramePr>
               <a:graphicFrameLocks xmlns:a="http://schemas.openxmlformats.org/drawingml/2006/main" noChangeAspect="1"/>
             </wp:cNvGraphicFramePr>
@@ -1946,7 +1815,7 @@
                   <pic:spPr>
                     <a:xfrm>
                       <a:off x="0" y="0"/>
-                      <a:ext cx="5612130" cy="3493770"/>
+                      <a:ext cx="4328193" cy="2666555"/>
                     </a:xfrm>
                     <a:prstGeom prst="rect">
                       <a:avLst/>
@@ -1958,29 +1827,6 @@
           </wp:inline>
         </w:drawing>
       </w:r>
-      <w:r>
-        <w:rPr>
-          <w:b/>
-          <w:bCs/>
-        </w:rPr>
-        <w:t xml:space="preserve">Evidencia 18. </w:t>
-      </w:r>
-      <w:proofErr w:type="spellStart"/>
-      <w:r>
-        <w:rPr>
-          <w:b/>
-          <w:bCs/>
-        </w:rPr>
-        <w:t>Backend</w:t>
-      </w:r>
-      <w:proofErr w:type="spellEnd"/>
-      <w:r>
-        <w:rPr>
-          <w:b/>
-          <w:bCs/>
-        </w:rPr>
-        <w:t xml:space="preserve"> Core no disponible</w:t>
-      </w:r>
     </w:p>
     <w:p>
       <w:pPr>
@@ -1995,11 +1841,27 @@
           <w:bCs/>
         </w:rPr>
         <w:lastRenderedPageBreak/>
+        <w:t>Evidencia 17. Saldo insuficiente</w:t>
+      </w:r>
+    </w:p>
+    <w:p>
+      <w:pPr>
+        <w:jc w:val="center"/>
+        <w:rPr>
+          <w:b/>
+          <w:bCs/>
+        </w:rPr>
+      </w:pPr>
+      <w:r>
+        <w:rPr>
+          <w:b/>
+          <w:bCs/>
+        </w:rPr>
         <w:drawing>
-          <wp:inline distT="0" distB="0" distL="0" distR="0" wp14:anchorId="6D66D810" wp14:editId="565F492E">
-            <wp:extent cx="5612130" cy="2303780"/>
-            <wp:effectExtent l="0" t="0" r="7620" b="1270"/>
-            <wp:docPr id="22" name="Imagen 22"/>
+          <wp:inline distT="0" distB="0" distL="0" distR="0" wp14:anchorId="30334D66" wp14:editId="5C8B2E09">
+            <wp:extent cx="4235108" cy="2636520"/>
+            <wp:effectExtent l="0" t="0" r="0" b="0"/>
+            <wp:docPr id="21" name="Imagen 21"/>
             <wp:cNvGraphicFramePr>
               <a:graphicFrameLocks xmlns:a="http://schemas.openxmlformats.org/drawingml/2006/main" noChangeAspect="1"/>
             </wp:cNvGraphicFramePr>
@@ -2019,7 +1881,7 @@
                   <pic:spPr>
                     <a:xfrm>
                       <a:off x="0" y="0"/>
-                      <a:ext cx="5612130" cy="2303780"/>
+                      <a:ext cx="4250379" cy="2646027"/>
                     </a:xfrm>
                     <a:prstGeom prst="rect">
                       <a:avLst/>
@@ -2033,42 +1895,39 @@
       </w:r>
     </w:p>
     <w:p>
-      <w:r>
-        <w:t>Estas pruebas demuestran el manejo de errores de negocio y de disponibilidad de los servicios dependientes.</w:t>
-      </w:r>
-    </w:p>
-    <w:p>
-      <w:pPr>
-        <w:rPr>
-          <w:b/>
-          <w:bCs/>
-        </w:rPr>
-      </w:pPr>
-      <w:r>
-        <w:rPr>
-          <w:b/>
-          <w:bCs/>
-        </w:rPr>
-        <w:t>10. Organización y estructura del proyecto</w:t>
-      </w:r>
-    </w:p>
-    <w:p>
-      <w:pPr>
-        <w:rPr>
-          <w:b/>
-          <w:bCs/>
-        </w:rPr>
-      </w:pPr>
-      <w:r>
-        <w:rPr>
-          <w:b/>
-          <w:bCs/>
-        </w:rPr>
-        <w:t>Evidencia 19. Estructura general del proyecto</w:t>
-      </w:r>
-    </w:p>
-    <w:p>
-      <w:pPr>
+      <w:pPr>
+        <w:rPr>
+          <w:b/>
+          <w:bCs/>
+        </w:rPr>
+      </w:pPr>
+      <w:r>
+        <w:rPr>
+          <w:b/>
+          <w:bCs/>
+        </w:rPr>
+        <w:t xml:space="preserve">Evidencia 18. </w:t>
+      </w:r>
+      <w:proofErr w:type="spellStart"/>
+      <w:r>
+        <w:rPr>
+          <w:b/>
+          <w:bCs/>
+        </w:rPr>
+        <w:t>Backend</w:t>
+      </w:r>
+      <w:proofErr w:type="spellEnd"/>
+      <w:r>
+        <w:rPr>
+          <w:b/>
+          <w:bCs/>
+        </w:rPr>
+        <w:t xml:space="preserve"> Core no disponible</w:t>
+      </w:r>
+    </w:p>
+    <w:p>
+      <w:pPr>
+        <w:jc w:val="center"/>
         <w:rPr>
           <w:b/>
           <w:bCs/>
@@ -2080,10 +1939,10 @@
           <w:bCs/>
         </w:rPr>
         <w:drawing>
-          <wp:inline distT="0" distB="0" distL="0" distR="0" wp14:anchorId="39FA3D1B" wp14:editId="50071A90">
-            <wp:extent cx="2720576" cy="1379340"/>
-            <wp:effectExtent l="0" t="0" r="3810" b="0"/>
-            <wp:docPr id="23" name="Imagen 23"/>
+          <wp:inline distT="0" distB="0" distL="0" distR="0" wp14:anchorId="6D66D810" wp14:editId="0F12939D">
+            <wp:extent cx="4812030" cy="1975339"/>
+            <wp:effectExtent l="0" t="0" r="7620" b="6350"/>
+            <wp:docPr id="22" name="Imagen 22"/>
             <wp:cNvGraphicFramePr>
               <a:graphicFrameLocks xmlns:a="http://schemas.openxmlformats.org/drawingml/2006/main" noChangeAspect="1"/>
             </wp:cNvGraphicFramePr>
@@ -2103,7 +1962,7 @@
                   <pic:spPr>
                     <a:xfrm>
                       <a:off x="0" y="0"/>
-                      <a:ext cx="2720576" cy="1379340"/>
+                      <a:ext cx="4824347" cy="1980395"/>
                     </a:xfrm>
                     <a:prstGeom prst="rect">
                       <a:avLst/>
@@ -2117,38 +1976,57 @@
       </w:r>
     </w:p>
     <w:p>
-      <w:pPr>
-        <w:rPr>
-          <w:b/>
-          <w:bCs/>
-        </w:rPr>
-      </w:pPr>
-      <w:r>
-        <w:rPr>
-          <w:b/>
-          <w:bCs/>
-        </w:rPr>
-        <w:t>Evidencia 20. Organización interna de un BFF</w:t>
-      </w:r>
-    </w:p>
-    <w:p>
-      <w:pPr>
-        <w:rPr>
-          <w:b/>
-          <w:bCs/>
-        </w:rPr>
-      </w:pPr>
-      <w:r>
-        <w:rPr>
-          <w:b/>
-          <w:bCs/>
-        </w:rPr>
-        <w:lastRenderedPageBreak/>
+      <w:r>
+        <w:t>Estas pruebas demuestran el manejo de errores de negocio y de disponibilidad de los servicios dependientes.</w:t>
+      </w:r>
+    </w:p>
+    <w:p>
+      <w:pPr>
+        <w:rPr>
+          <w:b/>
+          <w:bCs/>
+        </w:rPr>
+      </w:pPr>
+      <w:r>
+        <w:rPr>
+          <w:b/>
+          <w:bCs/>
+        </w:rPr>
+        <w:t>10. Organización y estructura del proyecto</w:t>
+      </w:r>
+    </w:p>
+    <w:p>
+      <w:pPr>
+        <w:rPr>
+          <w:b/>
+          <w:bCs/>
+        </w:rPr>
+      </w:pPr>
+      <w:r>
+        <w:rPr>
+          <w:b/>
+          <w:bCs/>
+        </w:rPr>
+        <w:t>Evidencia 19. Estructura general del proyecto</w:t>
+      </w:r>
+    </w:p>
+    <w:p>
+      <w:pPr>
+        <w:rPr>
+          <w:b/>
+          <w:bCs/>
+        </w:rPr>
+      </w:pPr>
+      <w:r>
+        <w:rPr>
+          <w:b/>
+          <w:bCs/>
+        </w:rPr>
         <w:drawing>
-          <wp:inline distT="0" distB="0" distL="0" distR="0" wp14:anchorId="17E426E7" wp14:editId="26B524CA">
-            <wp:extent cx="3795089" cy="5715495"/>
-            <wp:effectExtent l="0" t="0" r="0" b="0"/>
-            <wp:docPr id="24" name="Imagen 24"/>
+          <wp:inline distT="0" distB="0" distL="0" distR="0" wp14:anchorId="39FA3D1B" wp14:editId="5CD3A822">
+            <wp:extent cx="2915722" cy="1478280"/>
+            <wp:effectExtent l="0" t="0" r="0" b="7620"/>
+            <wp:docPr id="23" name="Imagen 23"/>
             <wp:cNvGraphicFramePr>
               <a:graphicFrameLocks xmlns:a="http://schemas.openxmlformats.org/drawingml/2006/main" noChangeAspect="1"/>
             </wp:cNvGraphicFramePr>
@@ -2168,7 +2046,7 @@
                   <pic:spPr>
                     <a:xfrm>
                       <a:off x="0" y="0"/>
-                      <a:ext cx="3795089" cy="5715495"/>
+                      <a:ext cx="2916861" cy="1478858"/>
                     </a:xfrm>
                     <a:prstGeom prst="rect">
                       <a:avLst/>
@@ -2182,6 +2060,86 @@
       </w:r>
     </w:p>
     <w:p>
+      <w:pPr>
+        <w:rPr>
+          <w:b/>
+          <w:bCs/>
+        </w:rPr>
+      </w:pPr>
+      <w:r>
+        <w:rPr>
+          <w:b/>
+          <w:bCs/>
+        </w:rPr>
+        <w:br w:type="page"/>
+      </w:r>
+    </w:p>
+    <w:p>
+      <w:pPr>
+        <w:rPr>
+          <w:b/>
+          <w:bCs/>
+        </w:rPr>
+      </w:pPr>
+      <w:r>
+        <w:rPr>
+          <w:b/>
+          <w:bCs/>
+        </w:rPr>
+        <w:lastRenderedPageBreak/>
+        <w:t>Evidencia 20. Organización interna de un BFF</w:t>
+      </w:r>
+    </w:p>
+    <w:p>
+      <w:pPr>
+        <w:rPr>
+          <w:b/>
+          <w:bCs/>
+        </w:rPr>
+      </w:pPr>
+      <w:r>
+        <w:rPr>
+          <w:b/>
+          <w:bCs/>
+        </w:rPr>
+        <w:drawing>
+          <wp:inline distT="0" distB="0" distL="0" distR="0" wp14:anchorId="17E426E7" wp14:editId="4FBE8CF7">
+            <wp:extent cx="2667000" cy="4016567"/>
+            <wp:effectExtent l="0" t="0" r="0" b="3175"/>
+            <wp:docPr id="24" name="Imagen 24"/>
+            <wp:cNvGraphicFramePr>
+              <a:graphicFrameLocks xmlns:a="http://schemas.openxmlformats.org/drawingml/2006/main" noChangeAspect="1"/>
+            </wp:cNvGraphicFramePr>
+            <a:graphic xmlns:a="http://schemas.openxmlformats.org/drawingml/2006/main">
+              <a:graphicData uri="http://schemas.openxmlformats.org/drawingml/2006/picture">
+                <pic:pic xmlns:pic="http://schemas.openxmlformats.org/drawingml/2006/picture">
+                  <pic:nvPicPr>
+                    <pic:cNvPr id="1" name=""/>
+                    <pic:cNvPicPr/>
+                  </pic:nvPicPr>
+                  <pic:blipFill>
+                    <a:blip r:embed="rId27"/>
+                    <a:stretch>
+                      <a:fillRect/>
+                    </a:stretch>
+                  </pic:blipFill>
+                  <pic:spPr>
+                    <a:xfrm>
+                      <a:off x="0" y="0"/>
+                      <a:ext cx="2670986" cy="4022570"/>
+                    </a:xfrm>
+                    <a:prstGeom prst="rect">
+                      <a:avLst/>
+                    </a:prstGeom>
+                  </pic:spPr>
+                </pic:pic>
+              </a:graphicData>
+            </a:graphic>
+          </wp:inline>
+        </w:drawing>
+      </w:r>
+    </w:p>
+    <w:p>
       <w:r>
         <w:t>Esta evidencia demuestra la organización modular y facilita la evolución independiente de cada BFF.</w:t>
       </w:r>
@@ -2223,23 +2181,111 @@
           <w:bCs/>
         </w:rPr>
       </w:pPr>
-    </w:p>
-    <w:p>
-      <w:pPr>
-        <w:rPr>
-          <w:b/>
-          <w:bCs/>
-        </w:rPr>
-      </w:pPr>
-      <w:r>
-        <w:rPr>
-          <w:b/>
-          <w:bCs/>
-        </w:rPr>
+      <w:r>
+        <w:rPr>
+          <w:b/>
+          <w:bCs/>
+        </w:rPr>
+        <w:drawing>
+          <wp:inline distT="0" distB="0" distL="0" distR="0" wp14:anchorId="3C78AF2C" wp14:editId="75291978">
+            <wp:extent cx="5612130" cy="2465705"/>
+            <wp:effectExtent l="0" t="0" r="7620" b="0"/>
+            <wp:docPr id="27" name="Imagen 27"/>
+            <wp:cNvGraphicFramePr>
+              <a:graphicFrameLocks xmlns:a="http://schemas.openxmlformats.org/drawingml/2006/main" noChangeAspect="1"/>
+            </wp:cNvGraphicFramePr>
+            <a:graphic xmlns:a="http://schemas.openxmlformats.org/drawingml/2006/main">
+              <a:graphicData uri="http://schemas.openxmlformats.org/drawingml/2006/picture">
+                <pic:pic xmlns:pic="http://schemas.openxmlformats.org/drawingml/2006/picture">
+                  <pic:nvPicPr>
+                    <pic:cNvPr id="1" name=""/>
+                    <pic:cNvPicPr/>
+                  </pic:nvPicPr>
+                  <pic:blipFill>
+                    <a:blip r:embed="rId28"/>
+                    <a:stretch>
+                      <a:fillRect/>
+                    </a:stretch>
+                  </pic:blipFill>
+                  <pic:spPr>
+                    <a:xfrm>
+                      <a:off x="0" y="0"/>
+                      <a:ext cx="5612130" cy="2465705"/>
+                    </a:xfrm>
+                    <a:prstGeom prst="rect">
+                      <a:avLst/>
+                    </a:prstGeom>
+                  </pic:spPr>
+                </pic:pic>
+              </a:graphicData>
+            </a:graphic>
+          </wp:inline>
+        </w:drawing>
+      </w:r>
+    </w:p>
+    <w:p>
+      <w:pPr>
+        <w:rPr>
+          <w:b/>
+          <w:bCs/>
+        </w:rPr>
+      </w:pPr>
+    </w:p>
+    <w:p>
+      <w:pPr>
+        <w:rPr>
+          <w:b/>
+          <w:bCs/>
+        </w:rPr>
+      </w:pPr>
+      <w:r>
+        <w:rPr>
+          <w:b/>
+          <w:bCs/>
+        </w:rPr>
+        <w:lastRenderedPageBreak/>
         <w:t>Evidencia 22. README</w:t>
       </w:r>
     </w:p>
-    <w:p/>
+    <w:p>
+      <w:r>
+        <w:drawing>
+          <wp:inline distT="0" distB="0" distL="0" distR="0" wp14:anchorId="63443048" wp14:editId="59406F92">
+            <wp:extent cx="4667250" cy="3462679"/>
+            <wp:effectExtent l="0" t="0" r="0" b="4445"/>
+            <wp:docPr id="26" name="Imagen 26"/>
+            <wp:cNvGraphicFramePr>
+              <a:graphicFrameLocks xmlns:a="http://schemas.openxmlformats.org/drawingml/2006/main" noChangeAspect="1"/>
+            </wp:cNvGraphicFramePr>
+            <a:graphic xmlns:a="http://schemas.openxmlformats.org/drawingml/2006/main">
+              <a:graphicData uri="http://schemas.openxmlformats.org/drawingml/2006/picture">
+                <pic:pic xmlns:pic="http://schemas.openxmlformats.org/drawingml/2006/picture">
+                  <pic:nvPicPr>
+                    <pic:cNvPr id="1" name=""/>
+                    <pic:cNvPicPr/>
+                  </pic:nvPicPr>
+                  <pic:blipFill>
+                    <a:blip r:embed="rId29"/>
+                    <a:stretch>
+                      <a:fillRect/>
+                    </a:stretch>
+                  </pic:blipFill>
+                  <pic:spPr>
+                    <a:xfrm>
+                      <a:off x="0" y="0"/>
+                      <a:ext cx="4670653" cy="3465204"/>
+                    </a:xfrm>
+                    <a:prstGeom prst="rect">
+                      <a:avLst/>
+                    </a:prstGeom>
+                  </pic:spPr>
+                </pic:pic>
+              </a:graphicData>
+            </a:graphic>
+          </wp:inline>
+        </w:drawing>
+      </w:r>
+    </w:p>
     <w:p>
       <w:pPr>
         <w:rPr>
@@ -2257,7 +2303,6 @@
     </w:p>
     <w:p>
       <w:r>
-        <w:lastRenderedPageBreak/>
         <w:t>Las evidencias presentadas permiten comprobar el funcionamiento completo de la solución sin repetir innecesariamente las mismas pruebas.</w:t>
       </w:r>
     </w:p>
@@ -7957,6 +8002,29 @@
       </w:tblBorders>
     </w:tblPr>
   </w:style>
+  <w:style w:type="character" w:styleId="Hipervnculo">
+    <w:name w:val="Hyperlink"/>
+    <w:basedOn w:val="Fuentedeprrafopredeter"/>
+    <w:uiPriority w:val="99"/>
+    <w:unhideWhenUsed/>
+    <w:rsid w:val="00836F77"/>
+    <w:rPr>
+      <w:color w:val="0563C1" w:themeColor="hyperlink"/>
+      <w:u w:val="single"/>
+    </w:rPr>
+  </w:style>
+  <w:style w:type="character" w:styleId="Mencinsinresolver">
+    <w:name w:val="Unresolved Mention"/>
+    <w:basedOn w:val="Fuentedeprrafopredeter"/>
+    <w:uiPriority w:val="99"/>
+    <w:semiHidden/>
+    <w:unhideWhenUsed/>
+    <w:rsid w:val="00836F77"/>
+    <w:rPr>
+      <w:color w:val="605E5C"/>
+      <w:shd w:val="clear" w:color="auto" w:fill="E1DFDD"/>
+    </w:rPr>
+  </w:style>
 </w:styles>
 </file>
 

</xml_diff>